<commit_message>
Add image sizes to content Word docs
Co-Authored-By: Claude Opus 5.5 <noreply@anthropic.com>
</commit_message>
<xml_diff>
--- a/VELARA_contenido_web.docx
+++ b/VELARA_contenido_web.docx
@@ -173,6 +173,691 @@
       </w:r>
     </w:p>
     <w:p>
+      <w:pPr>
+        <w:pStyle w:val="Heading2"/>
+      </w:pPr>
+      <w:r>
+        <w:t xml:space="preserve">Medidas de las imágenes</w:t>
+      </w:r>
+    </w:p>
+    <w:p>
+      <w:pPr>
+        <w:spacing w:after="140"/>
+      </w:pPr>
+      <w:r>
+        <w:rPr>
+          <w:rFonts w:ascii="Arial" w:cs="Arial" w:eastAsia="Arial" w:hAnsi="Arial"/>
+          <w:i/>
+          <w:iCs/>
+          <w:color w:val="6B6D70"/>
+          <w:sz w:val="18"/>
+          <w:szCs w:val="18"/>
+        </w:rPr>
+        <w:t xml:space="preserve">Cada casilla de foto dice en rojo la medida exacta de su espacio. Si la foto que pegue no tiene esa medida exacta no pasa nada: yo la recorto y la optimizo. Lo importante es que respete la forma (horizontal, cuadrada…).</w:t>
+      </w:r>
+    </w:p>
+    <w:tbl>
+      <w:tblPr>
+        <w:tblW w:type="dxa" w:w="9360"/>
+        <w:tblBorders>
+          <w:top w:val="single" w:color="auto" w:sz="4"/>
+          <w:left w:val="single" w:color="auto" w:sz="4"/>
+          <w:bottom w:val="single" w:color="auto" w:sz="4"/>
+          <w:right w:val="single" w:color="auto" w:sz="4"/>
+          <w:insideH w:val="single" w:color="auto" w:sz="4"/>
+          <w:insideV w:val="single" w:color="auto" w:sz="4"/>
+        </w:tblBorders>
+      </w:tblPr>
+      <w:tblGrid>
+        <w:gridCol w:w="2600"/>
+        <w:gridCol w:w="2200"/>
+        <w:gridCol w:w="4560"/>
+      </w:tblGrid>
+      <w:tr>
+        <w:trPr>
+          <w:cantSplit/>
+        </w:trPr>
+        <w:tc>
+          <w:tcPr>
+            <w:tcW w:type="dxa" w:w="2600"/>
+            <w:tcBorders>
+              <w:top w:val="single" w:color="D9D6CF" w:sz="4"/>
+              <w:left w:val="single" w:color="D9D6CF" w:sz="4"/>
+              <w:bottom w:val="single" w:color="D9D6CF" w:sz="4"/>
+              <w:right w:val="single" w:color="D9D6CF" w:sz="4"/>
+            </w:tcBorders>
+            <w:shd w:fill="F2F0EA" w:color="auto" w:val="clear"/>
+            <w:tcMar>
+              <w:top w:type="dxa" w:w="100"/>
+              <w:left w:type="dxa" w:w="140"/>
+              <w:bottom w:type="dxa" w:w="100"/>
+              <w:right w:type="dxa" w:w="140"/>
+            </w:tcMar>
+          </w:tcPr>
+          <w:p>
+            <w:pPr>
+              <w:spacing w:after="0"/>
+            </w:pPr>
+            <w:r>
+              <w:rPr>
+                <w:rFonts w:ascii="Arial" w:cs="Arial" w:eastAsia="Arial" w:hAnsi="Arial"/>
+                <w:b/>
+                <w:bCs/>
+                <w:color w:val="0B0B0B"/>
+                <w:sz w:val="19"/>
+                <w:szCs w:val="19"/>
+              </w:rPr>
+              <w:t xml:space="preserve">Dónde va</w:t>
+            </w:r>
+          </w:p>
+        </w:tc>
+        <w:tc>
+          <w:tcPr>
+            <w:tcW w:type="dxa" w:w="2200"/>
+            <w:tcBorders>
+              <w:top w:val="single" w:color="D9D6CF" w:sz="4"/>
+              <w:left w:val="single" w:color="D9D6CF" w:sz="4"/>
+              <w:bottom w:val="single" w:color="D9D6CF" w:sz="4"/>
+              <w:right w:val="single" w:color="D9D6CF" w:sz="4"/>
+            </w:tcBorders>
+            <w:shd w:fill="F2F0EA" w:color="auto" w:val="clear"/>
+            <w:tcMar>
+              <w:top w:type="dxa" w:w="100"/>
+              <w:left w:type="dxa" w:w="140"/>
+              <w:bottom w:type="dxa" w:w="100"/>
+              <w:right w:type="dxa" w:w="140"/>
+            </w:tcMar>
+          </w:tcPr>
+          <w:p>
+            <w:pPr>
+              <w:spacing w:after="0"/>
+            </w:pPr>
+            <w:r>
+              <w:rPr>
+                <w:rFonts w:ascii="Arial" w:cs="Arial" w:eastAsia="Arial" w:hAnsi="Arial"/>
+                <w:b/>
+                <w:bCs/>
+                <w:color w:val="0B0B0B"/>
+                <w:sz w:val="19"/>
+                <w:szCs w:val="19"/>
+              </w:rPr>
+              <w:t xml:space="preserve">Medida</w:t>
+            </w:r>
+          </w:p>
+        </w:tc>
+        <w:tc>
+          <w:tcPr>
+            <w:tcW w:type="dxa" w:w="4560"/>
+            <w:tcBorders>
+              <w:top w:val="single" w:color="D9D6CF" w:sz="4"/>
+              <w:left w:val="single" w:color="D9D6CF" w:sz="4"/>
+              <w:bottom w:val="single" w:color="D9D6CF" w:sz="4"/>
+              <w:right w:val="single" w:color="D9D6CF" w:sz="4"/>
+            </w:tcBorders>
+            <w:shd w:fill="F2F0EA" w:color="auto" w:val="clear"/>
+            <w:tcMar>
+              <w:top w:type="dxa" w:w="100"/>
+              <w:left w:type="dxa" w:w="140"/>
+              <w:bottom w:type="dxa" w:w="100"/>
+              <w:right w:type="dxa" w:w="140"/>
+            </w:tcMar>
+          </w:tcPr>
+          <w:p>
+            <w:pPr>
+              <w:spacing w:after="0"/>
+            </w:pPr>
+            <w:r>
+              <w:rPr>
+                <w:rFonts w:ascii="Arial" w:cs="Arial" w:eastAsia="Arial" w:hAnsi="Arial"/>
+                <w:b/>
+                <w:bCs/>
+                <w:color w:val="0B0B0B"/>
+                <w:sz w:val="19"/>
+                <w:szCs w:val="19"/>
+              </w:rPr>
+              <w:t xml:space="preserve">Forma</w:t>
+            </w:r>
+          </w:p>
+        </w:tc>
+      </w:tr>
+      <w:tr>
+        <w:trPr>
+          <w:cantSplit/>
+        </w:trPr>
+        <w:tc>
+          <w:tcPr>
+            <w:tcW w:type="dxa" w:w="2600"/>
+            <w:tcBorders>
+              <w:top w:val="single" w:color="D9D6CF" w:sz="4"/>
+              <w:left w:val="single" w:color="D9D6CF" w:sz="4"/>
+              <w:bottom w:val="single" w:color="D9D6CF" w:sz="4"/>
+              <w:right w:val="single" w:color="D9D6CF" w:sz="4"/>
+            </w:tcBorders>
+            <w:tcMar>
+              <w:top w:type="dxa" w:w="100"/>
+              <w:left w:type="dxa" w:w="140"/>
+              <w:bottom w:type="dxa" w:w="100"/>
+              <w:right w:type="dxa" w:w="140"/>
+            </w:tcMar>
+          </w:tcPr>
+          <w:p>
+            <w:pPr>
+              <w:spacing w:after="0"/>
+            </w:pPr>
+            <w:r>
+              <w:rPr>
+                <w:rFonts w:ascii="Arial" w:cs="Arial" w:eastAsia="Arial" w:hAnsi="Arial"/>
+                <w:b w:val="false"/>
+                <w:bCs w:val="false"/>
+                <w:color w:val="0B0B0B"/>
+                <w:sz w:val="19"/>
+                <w:szCs w:val="19"/>
+              </w:rPr>
+              <w:t xml:space="preserve">Portada (carrusel)</w:t>
+            </w:r>
+          </w:p>
+        </w:tc>
+        <w:tc>
+          <w:tcPr>
+            <w:tcW w:type="dxa" w:w="2200"/>
+            <w:tcBorders>
+              <w:top w:val="single" w:color="D9D6CF" w:sz="4"/>
+              <w:left w:val="single" w:color="D9D6CF" w:sz="4"/>
+              <w:bottom w:val="single" w:color="D9D6CF" w:sz="4"/>
+              <w:right w:val="single" w:color="D9D6CF" w:sz="4"/>
+            </w:tcBorders>
+            <w:tcMar>
+              <w:top w:type="dxa" w:w="100"/>
+              <w:left w:type="dxa" w:w="140"/>
+              <w:bottom w:type="dxa" w:w="100"/>
+              <w:right w:type="dxa" w:w="140"/>
+            </w:tcMar>
+          </w:tcPr>
+          <w:p>
+            <w:pPr>
+              <w:spacing w:after="0"/>
+            </w:pPr>
+            <w:r>
+              <w:rPr>
+                <w:rFonts w:ascii="Arial" w:cs="Arial" w:eastAsia="Arial" w:hAnsi="Arial"/>
+                <w:b/>
+                <w:bCs/>
+                <w:color w:val="D71920"/>
+                <w:sz w:val="19"/>
+                <w:szCs w:val="19"/>
+              </w:rPr>
+              <w:t xml:space="preserve">2400 × 1350 px</w:t>
+            </w:r>
+          </w:p>
+        </w:tc>
+        <w:tc>
+          <w:tcPr>
+            <w:tcW w:type="dxa" w:w="4560"/>
+            <w:tcBorders>
+              <w:top w:val="single" w:color="D9D6CF" w:sz="4"/>
+              <w:left w:val="single" w:color="D9D6CF" w:sz="4"/>
+              <w:bottom w:val="single" w:color="D9D6CF" w:sz="4"/>
+              <w:right w:val="single" w:color="D9D6CF" w:sz="4"/>
+            </w:tcBorders>
+            <w:tcMar>
+              <w:top w:type="dxa" w:w="100"/>
+              <w:left w:type="dxa" w:w="140"/>
+              <w:bottom w:type="dxa" w:w="100"/>
+              <w:right w:type="dxa" w:w="140"/>
+            </w:tcMar>
+          </w:tcPr>
+          <w:p>
+            <w:pPr>
+              <w:spacing w:after="0"/>
+            </w:pPr>
+            <w:r>
+              <w:rPr>
+                <w:rFonts w:ascii="Arial" w:cs="Arial" w:eastAsia="Arial" w:hAnsi="Arial"/>
+                <w:b w:val="false"/>
+                <w:bCs w:val="false"/>
+                <w:color w:val="0B0B0B"/>
+                <w:sz w:val="19"/>
+                <w:szCs w:val="19"/>
+              </w:rPr>
+              <w:t xml:space="preserve">Horizontal 16:9</w:t>
+            </w:r>
+          </w:p>
+        </w:tc>
+      </w:tr>
+      <w:tr>
+        <w:trPr>
+          <w:cantSplit/>
+        </w:trPr>
+        <w:tc>
+          <w:tcPr>
+            <w:tcW w:type="dxa" w:w="2600"/>
+            <w:tcBorders>
+              <w:top w:val="single" w:color="D9D6CF" w:sz="4"/>
+              <w:left w:val="single" w:color="D9D6CF" w:sz="4"/>
+              <w:bottom w:val="single" w:color="D9D6CF" w:sz="4"/>
+              <w:right w:val="single" w:color="D9D6CF" w:sz="4"/>
+            </w:tcBorders>
+            <w:tcMar>
+              <w:top w:type="dxa" w:w="100"/>
+              <w:left w:type="dxa" w:w="140"/>
+              <w:bottom w:type="dxa" w:w="100"/>
+              <w:right w:type="dxa" w:w="140"/>
+            </w:tcMar>
+          </w:tcPr>
+          <w:p>
+            <w:pPr>
+              <w:spacing w:after="0"/>
+            </w:pPr>
+            <w:r>
+              <w:rPr>
+                <w:rFonts w:ascii="Arial" w:cs="Arial" w:eastAsia="Arial" w:hAnsi="Arial"/>
+                <w:b w:val="false"/>
+                <w:bCs w:val="false"/>
+                <w:color w:val="0B0B0B"/>
+                <w:sz w:val="19"/>
+                <w:szCs w:val="19"/>
+              </w:rPr>
+              <w:t xml:space="preserve">Bloque final de contacto</w:t>
+            </w:r>
+          </w:p>
+        </w:tc>
+        <w:tc>
+          <w:tcPr>
+            <w:tcW w:type="dxa" w:w="2200"/>
+            <w:tcBorders>
+              <w:top w:val="single" w:color="D9D6CF" w:sz="4"/>
+              <w:left w:val="single" w:color="D9D6CF" w:sz="4"/>
+              <w:bottom w:val="single" w:color="D9D6CF" w:sz="4"/>
+              <w:right w:val="single" w:color="D9D6CF" w:sz="4"/>
+            </w:tcBorders>
+            <w:tcMar>
+              <w:top w:type="dxa" w:w="100"/>
+              <w:left w:type="dxa" w:w="140"/>
+              <w:bottom w:type="dxa" w:w="100"/>
+              <w:right w:type="dxa" w:w="140"/>
+            </w:tcMar>
+          </w:tcPr>
+          <w:p>
+            <w:pPr>
+              <w:spacing w:after="0"/>
+            </w:pPr>
+            <w:r>
+              <w:rPr>
+                <w:rFonts w:ascii="Arial" w:cs="Arial" w:eastAsia="Arial" w:hAnsi="Arial"/>
+                <w:b/>
+                <w:bCs/>
+                <w:color w:val="D71920"/>
+                <w:sz w:val="19"/>
+                <w:szCs w:val="19"/>
+              </w:rPr>
+              <w:t xml:space="preserve">2400 × 1350 px</w:t>
+            </w:r>
+          </w:p>
+        </w:tc>
+        <w:tc>
+          <w:tcPr>
+            <w:tcW w:type="dxa" w:w="4560"/>
+            <w:tcBorders>
+              <w:top w:val="single" w:color="D9D6CF" w:sz="4"/>
+              <w:left w:val="single" w:color="D9D6CF" w:sz="4"/>
+              <w:bottom w:val="single" w:color="D9D6CF" w:sz="4"/>
+              <w:right w:val="single" w:color="D9D6CF" w:sz="4"/>
+            </w:tcBorders>
+            <w:tcMar>
+              <w:top w:type="dxa" w:w="100"/>
+              <w:left w:type="dxa" w:w="140"/>
+              <w:bottom w:type="dxa" w:w="100"/>
+              <w:right w:type="dxa" w:w="140"/>
+            </w:tcMar>
+          </w:tcPr>
+          <w:p>
+            <w:pPr>
+              <w:spacing w:after="0"/>
+            </w:pPr>
+            <w:r>
+              <w:rPr>
+                <w:rFonts w:ascii="Arial" w:cs="Arial" w:eastAsia="Arial" w:hAnsi="Arial"/>
+                <w:b w:val="false"/>
+                <w:bCs w:val="false"/>
+                <w:color w:val="0B0B0B"/>
+                <w:sz w:val="19"/>
+                <w:szCs w:val="19"/>
+              </w:rPr>
+              <w:t xml:space="preserve">Horizontal 16:9</w:t>
+            </w:r>
+          </w:p>
+        </w:tc>
+      </w:tr>
+      <w:tr>
+        <w:trPr>
+          <w:cantSplit/>
+        </w:trPr>
+        <w:tc>
+          <w:tcPr>
+            <w:tcW w:type="dxa" w:w="2600"/>
+            <w:tcBorders>
+              <w:top w:val="single" w:color="D9D6CF" w:sz="4"/>
+              <w:left w:val="single" w:color="D9D6CF" w:sz="4"/>
+              <w:bottom w:val="single" w:color="D9D6CF" w:sz="4"/>
+              <w:right w:val="single" w:color="D9D6CF" w:sz="4"/>
+            </w:tcBorders>
+            <w:tcMar>
+              <w:top w:type="dxa" w:w="100"/>
+              <w:left w:type="dxa" w:w="140"/>
+              <w:bottom w:type="dxa" w:w="100"/>
+              <w:right w:type="dxa" w:w="140"/>
+            </w:tcMar>
+          </w:tcPr>
+          <w:p>
+            <w:pPr>
+              <w:spacing w:after="0"/>
+            </w:pPr>
+            <w:r>
+              <w:rPr>
+                <w:rFonts w:ascii="Arial" w:cs="Arial" w:eastAsia="Arial" w:hAnsi="Arial"/>
+                <w:b w:val="false"/>
+                <w:bCs w:val="false"/>
+                <w:color w:val="0B0B0B"/>
+                <w:sz w:val="19"/>
+                <w:szCs w:val="19"/>
+              </w:rPr>
+              <w:t xml:space="preserve">Cabecera de páginas internas</w:t>
+            </w:r>
+          </w:p>
+        </w:tc>
+        <w:tc>
+          <w:tcPr>
+            <w:tcW w:type="dxa" w:w="2200"/>
+            <w:tcBorders>
+              <w:top w:val="single" w:color="D9D6CF" w:sz="4"/>
+              <w:left w:val="single" w:color="D9D6CF" w:sz="4"/>
+              <w:bottom w:val="single" w:color="D9D6CF" w:sz="4"/>
+              <w:right w:val="single" w:color="D9D6CF" w:sz="4"/>
+            </w:tcBorders>
+            <w:tcMar>
+              <w:top w:type="dxa" w:w="100"/>
+              <w:left w:type="dxa" w:w="140"/>
+              <w:bottom w:type="dxa" w:w="100"/>
+              <w:right w:type="dxa" w:w="140"/>
+            </w:tcMar>
+          </w:tcPr>
+          <w:p>
+            <w:pPr>
+              <w:spacing w:after="0"/>
+            </w:pPr>
+            <w:r>
+              <w:rPr>
+                <w:rFonts w:ascii="Arial" w:cs="Arial" w:eastAsia="Arial" w:hAnsi="Arial"/>
+                <w:b/>
+                <w:bCs/>
+                <w:color w:val="D71920"/>
+                <w:sz w:val="19"/>
+                <w:szCs w:val="19"/>
+              </w:rPr>
+              <w:t xml:space="preserve">2400 × 1000 px</w:t>
+            </w:r>
+          </w:p>
+        </w:tc>
+        <w:tc>
+          <w:tcPr>
+            <w:tcW w:type="dxa" w:w="4560"/>
+            <w:tcBorders>
+              <w:top w:val="single" w:color="D9D6CF" w:sz="4"/>
+              <w:left w:val="single" w:color="D9D6CF" w:sz="4"/>
+              <w:bottom w:val="single" w:color="D9D6CF" w:sz="4"/>
+              <w:right w:val="single" w:color="D9D6CF" w:sz="4"/>
+            </w:tcBorders>
+            <w:tcMar>
+              <w:top w:type="dxa" w:w="100"/>
+              <w:left w:type="dxa" w:w="140"/>
+              <w:bottom w:type="dxa" w:w="100"/>
+              <w:right w:type="dxa" w:w="140"/>
+            </w:tcMar>
+          </w:tcPr>
+          <w:p>
+            <w:pPr>
+              <w:spacing w:after="0"/>
+            </w:pPr>
+            <w:r>
+              <w:rPr>
+                <w:rFonts w:ascii="Arial" w:cs="Arial" w:eastAsia="Arial" w:hAnsi="Arial"/>
+                <w:b w:val="false"/>
+                <w:bCs w:val="false"/>
+                <w:color w:val="0B0B0B"/>
+                <w:sz w:val="19"/>
+                <w:szCs w:val="19"/>
+              </w:rPr>
+              <w:t xml:space="preserve">Horizontal muy ancha (12:5)</w:t>
+            </w:r>
+          </w:p>
+        </w:tc>
+      </w:tr>
+      <w:tr>
+        <w:trPr>
+          <w:cantSplit/>
+        </w:trPr>
+        <w:tc>
+          <w:tcPr>
+            <w:tcW w:type="dxa" w:w="2600"/>
+            <w:tcBorders>
+              <w:top w:val="single" w:color="D9D6CF" w:sz="4"/>
+              <w:left w:val="single" w:color="D9D6CF" w:sz="4"/>
+              <w:bottom w:val="single" w:color="D9D6CF" w:sz="4"/>
+              <w:right w:val="single" w:color="D9D6CF" w:sz="4"/>
+            </w:tcBorders>
+            <w:tcMar>
+              <w:top w:type="dxa" w:w="100"/>
+              <w:left w:type="dxa" w:w="140"/>
+              <w:bottom w:type="dxa" w:w="100"/>
+              <w:right w:type="dxa" w:w="140"/>
+            </w:tcMar>
+          </w:tcPr>
+          <w:p>
+            <w:pPr>
+              <w:spacing w:after="0"/>
+            </w:pPr>
+            <w:r>
+              <w:rPr>
+                <w:rFonts w:ascii="Arial" w:cs="Arial" w:eastAsia="Arial" w:hAnsi="Arial"/>
+                <w:b w:val="false"/>
+                <w:bCs w:val="false"/>
+                <w:color w:val="0B0B0B"/>
+                <w:sz w:val="19"/>
+                <w:szCs w:val="19"/>
+              </w:rPr>
+              <w:t xml:space="preserve">Tarjetas: servicios, aplicaciones, trabajos</w:t>
+            </w:r>
+          </w:p>
+        </w:tc>
+        <w:tc>
+          <w:tcPr>
+            <w:tcW w:type="dxa" w:w="2200"/>
+            <w:tcBorders>
+              <w:top w:val="single" w:color="D9D6CF" w:sz="4"/>
+              <w:left w:val="single" w:color="D9D6CF" w:sz="4"/>
+              <w:bottom w:val="single" w:color="D9D6CF" w:sz="4"/>
+              <w:right w:val="single" w:color="D9D6CF" w:sz="4"/>
+            </w:tcBorders>
+            <w:tcMar>
+              <w:top w:type="dxa" w:w="100"/>
+              <w:left w:type="dxa" w:w="140"/>
+              <w:bottom w:type="dxa" w:w="100"/>
+              <w:right w:type="dxa" w:w="140"/>
+            </w:tcMar>
+          </w:tcPr>
+          <w:p>
+            <w:pPr>
+              <w:spacing w:after="0"/>
+            </w:pPr>
+            <w:r>
+              <w:rPr>
+                <w:rFonts w:ascii="Arial" w:cs="Arial" w:eastAsia="Arial" w:hAnsi="Arial"/>
+                <w:b/>
+                <w:bCs/>
+                <w:color w:val="D71920"/>
+                <w:sz w:val="19"/>
+                <w:szCs w:val="19"/>
+              </w:rPr>
+              <w:t xml:space="preserve">1200 × 900 px</w:t>
+            </w:r>
+          </w:p>
+        </w:tc>
+        <w:tc>
+          <w:tcPr>
+            <w:tcW w:type="dxa" w:w="4560"/>
+            <w:tcBorders>
+              <w:top w:val="single" w:color="D9D6CF" w:sz="4"/>
+              <w:left w:val="single" w:color="D9D6CF" w:sz="4"/>
+              <w:bottom w:val="single" w:color="D9D6CF" w:sz="4"/>
+              <w:right w:val="single" w:color="D9D6CF" w:sz="4"/>
+            </w:tcBorders>
+            <w:tcMar>
+              <w:top w:type="dxa" w:w="100"/>
+              <w:left w:type="dxa" w:w="140"/>
+              <w:bottom w:type="dxa" w:w="100"/>
+              <w:right w:type="dxa" w:w="140"/>
+            </w:tcMar>
+          </w:tcPr>
+          <w:p>
+            <w:pPr>
+              <w:spacing w:after="0"/>
+            </w:pPr>
+            <w:r>
+              <w:rPr>
+                <w:rFonts w:ascii="Arial" w:cs="Arial" w:eastAsia="Arial" w:hAnsi="Arial"/>
+                <w:b w:val="false"/>
+                <w:bCs w:val="false"/>
+                <w:color w:val="0B0B0B"/>
+                <w:sz w:val="19"/>
+                <w:szCs w:val="19"/>
+              </w:rPr>
+              <w:t xml:space="preserve">Horizontal 4:3</w:t>
+            </w:r>
+          </w:p>
+        </w:tc>
+      </w:tr>
+      <w:tr>
+        <w:trPr>
+          <w:cantSplit/>
+        </w:trPr>
+        <w:tc>
+          <w:tcPr>
+            <w:tcW w:type="dxa" w:w="2600"/>
+            <w:tcBorders>
+              <w:top w:val="single" w:color="D9D6CF" w:sz="4"/>
+              <w:left w:val="single" w:color="D9D6CF" w:sz="4"/>
+              <w:bottom w:val="single" w:color="D9D6CF" w:sz="4"/>
+              <w:right w:val="single" w:color="D9D6CF" w:sz="4"/>
+            </w:tcBorders>
+            <w:tcMar>
+              <w:top w:type="dxa" w:w="100"/>
+              <w:left w:type="dxa" w:w="140"/>
+              <w:bottom w:type="dxa" w:w="100"/>
+              <w:right w:type="dxa" w:w="140"/>
+            </w:tcMar>
+          </w:tcPr>
+          <w:p>
+            <w:pPr>
+              <w:spacing w:after="0"/>
+            </w:pPr>
+            <w:r>
+              <w:rPr>
+                <w:rFonts w:ascii="Arial" w:cs="Arial" w:eastAsia="Arial" w:hAnsi="Arial"/>
+                <w:b w:val="false"/>
+                <w:bCs w:val="false"/>
+                <w:color w:val="0B0B0B"/>
+                <w:sz w:val="19"/>
+                <w:szCs w:val="19"/>
+              </w:rPr>
+              <w:t xml:space="preserve">Materiales destacados</w:t>
+            </w:r>
+          </w:p>
+        </w:tc>
+        <w:tc>
+          <w:tcPr>
+            <w:tcW w:type="dxa" w:w="2200"/>
+            <w:tcBorders>
+              <w:top w:val="single" w:color="D9D6CF" w:sz="4"/>
+              <w:left w:val="single" w:color="D9D6CF" w:sz="4"/>
+              <w:bottom w:val="single" w:color="D9D6CF" w:sz="4"/>
+              <w:right w:val="single" w:color="D9D6CF" w:sz="4"/>
+            </w:tcBorders>
+            <w:tcMar>
+              <w:top w:type="dxa" w:w="100"/>
+              <w:left w:type="dxa" w:w="140"/>
+              <w:bottom w:type="dxa" w:w="100"/>
+              <w:right w:type="dxa" w:w="140"/>
+            </w:tcMar>
+          </w:tcPr>
+          <w:p>
+            <w:pPr>
+              <w:spacing w:after="0"/>
+            </w:pPr>
+            <w:r>
+              <w:rPr>
+                <w:rFonts w:ascii="Arial" w:cs="Arial" w:eastAsia="Arial" w:hAnsi="Arial"/>
+                <w:b/>
+                <w:bCs/>
+                <w:color w:val="D71920"/>
+                <w:sz w:val="19"/>
+                <w:szCs w:val="19"/>
+              </w:rPr>
+              <w:t xml:space="preserve">1000 × 1000 px</w:t>
+            </w:r>
+          </w:p>
+        </w:tc>
+        <w:tc>
+          <w:tcPr>
+            <w:tcW w:type="dxa" w:w="4560"/>
+            <w:tcBorders>
+              <w:top w:val="single" w:color="D9D6CF" w:sz="4"/>
+              <w:left w:val="single" w:color="D9D6CF" w:sz="4"/>
+              <w:bottom w:val="single" w:color="D9D6CF" w:sz="4"/>
+              <w:right w:val="single" w:color="D9D6CF" w:sz="4"/>
+            </w:tcBorders>
+            <w:tcMar>
+              <w:top w:type="dxa" w:w="100"/>
+              <w:left w:type="dxa" w:w="140"/>
+              <w:bottom w:type="dxa" w:w="100"/>
+              <w:right w:type="dxa" w:w="140"/>
+            </w:tcMar>
+          </w:tcPr>
+          <w:p>
+            <w:pPr>
+              <w:spacing w:after="0"/>
+            </w:pPr>
+            <w:r>
+              <w:rPr>
+                <w:rFonts w:ascii="Arial" w:cs="Arial" w:eastAsia="Arial" w:hAnsi="Arial"/>
+                <w:b w:val="false"/>
+                <w:bCs w:val="false"/>
+                <w:color w:val="0B0B0B"/>
+                <w:sz w:val="19"/>
+                <w:szCs w:val="19"/>
+              </w:rPr>
+              <w:t xml:space="preserve">Cuadrada 1:1</w:t>
+            </w:r>
+          </w:p>
+        </w:tc>
+      </w:tr>
+    </w:tbl>
+    <w:p>
+      <w:pPr>
+        <w:spacing w:after="140"/>
+      </w:pPr>
+      <w:r>
+        <w:rPr>
+          <w:rFonts w:ascii="Arial" w:cs="Arial" w:eastAsia="Arial" w:hAnsi="Arial"/>
+          <w:i/>
+          <w:iCs/>
+          <w:color w:val="6B6D70"/>
+          <w:sz w:val="18"/>
+          <w:szCs w:val="18"/>
+        </w:rPr>
+        <w:t xml:space="preserve">Formato: JPG. Peso: idealmente menos de 1 MB por foto. Use fotos nítidas, bien iluminadas y sin texto encima.</w:t>
+      </w:r>
+    </w:p>
+    <w:p>
       <w:r>
         <w:br w:type="page"/>
       </w:r>
@@ -340,6 +1025,36 @@
           </w:p>
           <w:p>
             <w:pPr>
+              <w:spacing w:after="20" w:before="60"/>
+            </w:pPr>
+            <w:r>
+              <w:rPr>
+                <w:rFonts w:ascii="Arial" w:cs="Arial" w:eastAsia="Arial" w:hAnsi="Arial"/>
+                <w:b/>
+                <w:bCs/>
+                <w:color w:val="D71920"/>
+                <w:sz w:val="19"/>
+                <w:szCs w:val="19"/>
+              </w:rPr>
+              <w:t xml:space="preserve">MEDIDA: 2400 × 1350 px  ·  Horizontal 16:9</w:t>
+            </w:r>
+          </w:p>
+          <w:p>
+            <w:pPr>
+              <w:spacing w:after="40"/>
+            </w:pPr>
+            <w:r>
+              <w:rPr>
+                <w:rFonts w:ascii="Arial" w:cs="Arial" w:eastAsia="Arial" w:hAnsi="Arial"/>
+                <w:color w:val="6B6D70"/>
+                <w:sz w:val="16"/>
+                <w:szCs w:val="16"/>
+              </w:rPr>
+              <w:t xml:space="preserve">Ocupa toda la pantalla. El texto va abajo a la izquierda: deje esa zona limpia u oscura. En celular se ve solo el centro de la foto.</w:t>
+            </w:r>
+          </w:p>
+          <w:p>
+            <w:pPr>
               <w:spacing w:after="20"/>
             </w:pPr>
             <w:r>
@@ -797,6 +1512,36 @@
           </w:p>
           <w:p>
             <w:pPr>
+              <w:spacing w:after="20" w:before="60"/>
+            </w:pPr>
+            <w:r>
+              <w:rPr>
+                <w:rFonts w:ascii="Arial" w:cs="Arial" w:eastAsia="Arial" w:hAnsi="Arial"/>
+                <w:b/>
+                <w:bCs/>
+                <w:color w:val="D71920"/>
+                <w:sz w:val="19"/>
+                <w:szCs w:val="19"/>
+              </w:rPr>
+              <w:t xml:space="preserve">MEDIDA: 2400 × 1350 px  ·  Horizontal 16:9</w:t>
+            </w:r>
+          </w:p>
+          <w:p>
+            <w:pPr>
+              <w:spacing w:after="40"/>
+            </w:pPr>
+            <w:r>
+              <w:rPr>
+                <w:rFonts w:ascii="Arial" w:cs="Arial" w:eastAsia="Arial" w:hAnsi="Arial"/>
+                <w:color w:val="6B6D70"/>
+                <w:sz w:val="16"/>
+                <w:szCs w:val="16"/>
+              </w:rPr>
+              <w:t xml:space="preserve">Ocupa toda la pantalla. El texto va abajo a la izquierda: deje esa zona limpia u oscura. En celular se ve solo el centro de la foto.</w:t>
+            </w:r>
+          </w:p>
+          <w:p>
+            <w:pPr>
               <w:spacing w:after="20"/>
             </w:pPr>
             <w:r>
@@ -1254,6 +1999,36 @@
           </w:p>
           <w:p>
             <w:pPr>
+              <w:spacing w:after="20" w:before="60"/>
+            </w:pPr>
+            <w:r>
+              <w:rPr>
+                <w:rFonts w:ascii="Arial" w:cs="Arial" w:eastAsia="Arial" w:hAnsi="Arial"/>
+                <w:b/>
+                <w:bCs/>
+                <w:color w:val="D71920"/>
+                <w:sz w:val="19"/>
+                <w:szCs w:val="19"/>
+              </w:rPr>
+              <w:t xml:space="preserve">MEDIDA: 2400 × 1350 px  ·  Horizontal 16:9</w:t>
+            </w:r>
+          </w:p>
+          <w:p>
+            <w:pPr>
+              <w:spacing w:after="40"/>
+            </w:pPr>
+            <w:r>
+              <w:rPr>
+                <w:rFonts w:ascii="Arial" w:cs="Arial" w:eastAsia="Arial" w:hAnsi="Arial"/>
+                <w:color w:val="6B6D70"/>
+                <w:sz w:val="16"/>
+                <w:szCs w:val="16"/>
+              </w:rPr>
+              <w:t xml:space="preserve">Ocupa toda la pantalla. El texto va abajo a la izquierda: deje esa zona limpia u oscura. En celular se ve solo el centro de la foto.</w:t>
+            </w:r>
+          </w:p>
+          <w:p>
+            <w:pPr>
               <w:spacing w:after="20"/>
             </w:pPr>
             <w:r>
@@ -1947,6 +2722,36 @@
           </w:p>
           <w:p>
             <w:pPr>
+              <w:spacing w:after="20" w:before="60"/>
+            </w:pPr>
+            <w:r>
+              <w:rPr>
+                <w:rFonts w:ascii="Arial" w:cs="Arial" w:eastAsia="Arial" w:hAnsi="Arial"/>
+                <w:b/>
+                <w:bCs/>
+                <w:color w:val="D71920"/>
+                <w:sz w:val="19"/>
+                <w:szCs w:val="19"/>
+              </w:rPr>
+              <w:t xml:space="preserve">MEDIDA: 1200 × 900 px  ·  Horizontal 4:3</w:t>
+            </w:r>
+          </w:p>
+          <w:p>
+            <w:pPr>
+              <w:spacing w:after="40"/>
+            </w:pPr>
+            <w:r>
+              <w:rPr>
+                <w:rFonts w:ascii="Arial" w:cs="Arial" w:eastAsia="Arial" w:hAnsi="Arial"/>
+                <w:color w:val="6B6D70"/>
+                <w:sz w:val="16"/>
+                <w:szCs w:val="16"/>
+              </w:rPr>
+              <w:t xml:space="preserve">Tarjeta. Se muestra completa, sin recortes.</w:t>
+            </w:r>
+          </w:p>
+          <w:p>
+            <w:pPr>
               <w:spacing w:after="20"/>
             </w:pPr>
             <w:r>
@@ -2436,6 +3241,36 @@
           </w:p>
           <w:p>
             <w:pPr>
+              <w:spacing w:after="20" w:before="60"/>
+            </w:pPr>
+            <w:r>
+              <w:rPr>
+                <w:rFonts w:ascii="Arial" w:cs="Arial" w:eastAsia="Arial" w:hAnsi="Arial"/>
+                <w:b/>
+                <w:bCs/>
+                <w:color w:val="D71920"/>
+                <w:sz w:val="19"/>
+                <w:szCs w:val="19"/>
+              </w:rPr>
+              <w:t xml:space="preserve">MEDIDA: 1200 × 900 px  ·  Horizontal 4:3</w:t>
+            </w:r>
+          </w:p>
+          <w:p>
+            <w:pPr>
+              <w:spacing w:after="40"/>
+            </w:pPr>
+            <w:r>
+              <w:rPr>
+                <w:rFonts w:ascii="Arial" w:cs="Arial" w:eastAsia="Arial" w:hAnsi="Arial"/>
+                <w:color w:val="6B6D70"/>
+                <w:sz w:val="16"/>
+                <w:szCs w:val="16"/>
+              </w:rPr>
+              <w:t xml:space="preserve">Tarjeta. Se muestra completa, sin recortes.</w:t>
+            </w:r>
+          </w:p>
+          <w:p>
+            <w:pPr>
               <w:spacing w:after="20"/>
             </w:pPr>
             <w:r>
@@ -2925,6 +3760,36 @@
           </w:p>
           <w:p>
             <w:pPr>
+              <w:spacing w:after="20" w:before="60"/>
+            </w:pPr>
+            <w:r>
+              <w:rPr>
+                <w:rFonts w:ascii="Arial" w:cs="Arial" w:eastAsia="Arial" w:hAnsi="Arial"/>
+                <w:b/>
+                <w:bCs/>
+                <w:color w:val="D71920"/>
+                <w:sz w:val="19"/>
+                <w:szCs w:val="19"/>
+              </w:rPr>
+              <w:t xml:space="preserve">MEDIDA: 1200 × 900 px  ·  Horizontal 4:3</w:t>
+            </w:r>
+          </w:p>
+          <w:p>
+            <w:pPr>
+              <w:spacing w:after="40"/>
+            </w:pPr>
+            <w:r>
+              <w:rPr>
+                <w:rFonts w:ascii="Arial" w:cs="Arial" w:eastAsia="Arial" w:hAnsi="Arial"/>
+                <w:color w:val="6B6D70"/>
+                <w:sz w:val="16"/>
+                <w:szCs w:val="16"/>
+              </w:rPr>
+              <w:t xml:space="preserve">Tarjeta. Se muestra completa, sin recortes.</w:t>
+            </w:r>
+          </w:p>
+          <w:p>
+            <w:pPr>
               <w:spacing w:after="20"/>
             </w:pPr>
             <w:r>
@@ -3414,6 +4279,36 @@
           </w:p>
           <w:p>
             <w:pPr>
+              <w:spacing w:after="20" w:before="60"/>
+            </w:pPr>
+            <w:r>
+              <w:rPr>
+                <w:rFonts w:ascii="Arial" w:cs="Arial" w:eastAsia="Arial" w:hAnsi="Arial"/>
+                <w:b/>
+                <w:bCs/>
+                <w:color w:val="D71920"/>
+                <w:sz w:val="19"/>
+                <w:szCs w:val="19"/>
+              </w:rPr>
+              <w:t xml:space="preserve">MEDIDA: 1200 × 900 px  ·  Horizontal 4:3</w:t>
+            </w:r>
+          </w:p>
+          <w:p>
+            <w:pPr>
+              <w:spacing w:after="40"/>
+            </w:pPr>
+            <w:r>
+              <w:rPr>
+                <w:rFonts w:ascii="Arial" w:cs="Arial" w:eastAsia="Arial" w:hAnsi="Arial"/>
+                <w:color w:val="6B6D70"/>
+                <w:sz w:val="16"/>
+                <w:szCs w:val="16"/>
+              </w:rPr>
+              <w:t xml:space="preserve">Tarjeta. Se muestra completa, sin recortes.</w:t>
+            </w:r>
+          </w:p>
+          <w:p>
+            <w:pPr>
               <w:spacing w:after="20"/>
             </w:pPr>
             <w:r>
@@ -3899,6 +4794,36 @@
                   </a:graphic>
                 </wp:inline>
               </w:drawing>
+            </w:r>
+          </w:p>
+          <w:p>
+            <w:pPr>
+              <w:spacing w:after="20" w:before="60"/>
+            </w:pPr>
+            <w:r>
+              <w:rPr>
+                <w:rFonts w:ascii="Arial" w:cs="Arial" w:eastAsia="Arial" w:hAnsi="Arial"/>
+                <w:b/>
+                <w:bCs/>
+                <w:color w:val="D71920"/>
+                <w:sz w:val="19"/>
+                <w:szCs w:val="19"/>
+              </w:rPr>
+              <w:t xml:space="preserve">MEDIDA: 1200 × 900 px  ·  Horizontal 4:3</w:t>
+            </w:r>
+          </w:p>
+          <w:p>
+            <w:pPr>
+              <w:spacing w:after="40"/>
+            </w:pPr>
+            <w:r>
+              <w:rPr>
+                <w:rFonts w:ascii="Arial" w:cs="Arial" w:eastAsia="Arial" w:hAnsi="Arial"/>
+                <w:color w:val="6B6D70"/>
+                <w:sz w:val="16"/>
+                <w:szCs w:val="16"/>
+              </w:rPr>
+              <w:t xml:space="preserve">Tarjeta. Se muestra completa, sin recortes.</w:t>
             </w:r>
           </w:p>
           <w:p>
@@ -6247,6 +7172,36 @@
           </w:p>
           <w:p>
             <w:pPr>
+              <w:spacing w:after="20" w:before="60"/>
+            </w:pPr>
+            <w:r>
+              <w:rPr>
+                <w:rFonts w:ascii="Arial" w:cs="Arial" w:eastAsia="Arial" w:hAnsi="Arial"/>
+                <w:b/>
+                <w:bCs/>
+                <w:color w:val="D71920"/>
+                <w:sz w:val="19"/>
+                <w:szCs w:val="19"/>
+              </w:rPr>
+              <w:t xml:space="preserve">MEDIDA: 1000 × 1000 px  ·  Cuadrada 1:1</w:t>
+            </w:r>
+          </w:p>
+          <w:p>
+            <w:pPr>
+              <w:spacing w:after="40"/>
+            </w:pPr>
+            <w:r>
+              <w:rPr>
+                <w:rFonts w:ascii="Arial" w:cs="Arial" w:eastAsia="Arial" w:hAnsi="Arial"/>
+                <w:color w:val="6B6D70"/>
+                <w:sz w:val="16"/>
+                <w:szCs w:val="16"/>
+              </w:rPr>
+              <w:t xml:space="preserve">Cuadro de material. Ideal: textura de cerca.</w:t>
+            </w:r>
+          </w:p>
+          <w:p>
+            <w:pPr>
               <w:spacing w:after="20"/>
             </w:pPr>
             <w:r>
@@ -6546,6 +7501,36 @@
           </w:p>
           <w:p>
             <w:pPr>
+              <w:spacing w:after="20" w:before="60"/>
+            </w:pPr>
+            <w:r>
+              <w:rPr>
+                <w:rFonts w:ascii="Arial" w:cs="Arial" w:eastAsia="Arial" w:hAnsi="Arial"/>
+                <w:b/>
+                <w:bCs/>
+                <w:color w:val="D71920"/>
+                <w:sz w:val="19"/>
+                <w:szCs w:val="19"/>
+              </w:rPr>
+              <w:t xml:space="preserve">MEDIDA: 1000 × 1000 px  ·  Cuadrada 1:1</w:t>
+            </w:r>
+          </w:p>
+          <w:p>
+            <w:pPr>
+              <w:spacing w:after="40"/>
+            </w:pPr>
+            <w:r>
+              <w:rPr>
+                <w:rFonts w:ascii="Arial" w:cs="Arial" w:eastAsia="Arial" w:hAnsi="Arial"/>
+                <w:color w:val="6B6D70"/>
+                <w:sz w:val="16"/>
+                <w:szCs w:val="16"/>
+              </w:rPr>
+              <w:t xml:space="preserve">Cuadro de material. Ideal: textura de cerca.</w:t>
+            </w:r>
+          </w:p>
+          <w:p>
+            <w:pPr>
               <w:spacing w:after="20"/>
             </w:pPr>
             <w:r>
@@ -6845,6 +7830,36 @@
           </w:p>
           <w:p>
             <w:pPr>
+              <w:spacing w:after="20" w:before="60"/>
+            </w:pPr>
+            <w:r>
+              <w:rPr>
+                <w:rFonts w:ascii="Arial" w:cs="Arial" w:eastAsia="Arial" w:hAnsi="Arial"/>
+                <w:b/>
+                <w:bCs/>
+                <w:color w:val="D71920"/>
+                <w:sz w:val="19"/>
+                <w:szCs w:val="19"/>
+              </w:rPr>
+              <w:t xml:space="preserve">MEDIDA: 1000 × 1000 px  ·  Cuadrada 1:1</w:t>
+            </w:r>
+          </w:p>
+          <w:p>
+            <w:pPr>
+              <w:spacing w:after="40"/>
+            </w:pPr>
+            <w:r>
+              <w:rPr>
+                <w:rFonts w:ascii="Arial" w:cs="Arial" w:eastAsia="Arial" w:hAnsi="Arial"/>
+                <w:color w:val="6B6D70"/>
+                <w:sz w:val="16"/>
+                <w:szCs w:val="16"/>
+              </w:rPr>
+              <w:t xml:space="preserve">Cuadro de material. Ideal: textura de cerca.</w:t>
+            </w:r>
+          </w:p>
+          <w:p>
+            <w:pPr>
               <w:spacing w:after="20"/>
             </w:pPr>
             <w:r>
@@ -7140,6 +8155,36 @@
                   </a:graphic>
                 </wp:inline>
               </w:drawing>
+            </w:r>
+          </w:p>
+          <w:p>
+            <w:pPr>
+              <w:spacing w:after="20" w:before="60"/>
+            </w:pPr>
+            <w:r>
+              <w:rPr>
+                <w:rFonts w:ascii="Arial" w:cs="Arial" w:eastAsia="Arial" w:hAnsi="Arial"/>
+                <w:b/>
+                <w:bCs/>
+                <w:color w:val="D71920"/>
+                <w:sz w:val="19"/>
+                <w:szCs w:val="19"/>
+              </w:rPr>
+              <w:t xml:space="preserve">MEDIDA: 1000 × 1000 px  ·  Cuadrada 1:1</w:t>
+            </w:r>
+          </w:p>
+          <w:p>
+            <w:pPr>
+              <w:spacing w:after="40"/>
+            </w:pPr>
+            <w:r>
+              <w:rPr>
+                <w:rFonts w:ascii="Arial" w:cs="Arial" w:eastAsia="Arial" w:hAnsi="Arial"/>
+                <w:color w:val="6B6D70"/>
+                <w:sz w:val="16"/>
+                <w:szCs w:val="16"/>
+              </w:rPr>
+              <w:t xml:space="preserve">Cuadro de material. Ideal: textura de cerca.</w:t>
             </w:r>
           </w:p>
           <w:p>
@@ -7996,6 +9041,36 @@
           </w:p>
           <w:p>
             <w:pPr>
+              <w:spacing w:after="20" w:before="60"/>
+            </w:pPr>
+            <w:r>
+              <w:rPr>
+                <w:rFonts w:ascii="Arial" w:cs="Arial" w:eastAsia="Arial" w:hAnsi="Arial"/>
+                <w:b/>
+                <w:bCs/>
+                <w:color w:val="D71920"/>
+                <w:sz w:val="19"/>
+                <w:szCs w:val="19"/>
+              </w:rPr>
+              <w:t xml:space="preserve">MEDIDA: 1200 × 900 px  ·  Horizontal 4:3</w:t>
+            </w:r>
+          </w:p>
+          <w:p>
+            <w:pPr>
+              <w:spacing w:after="40"/>
+            </w:pPr>
+            <w:r>
+              <w:rPr>
+                <w:rFonts w:ascii="Arial" w:cs="Arial" w:eastAsia="Arial" w:hAnsi="Arial"/>
+                <w:color w:val="6B6D70"/>
+                <w:sz w:val="16"/>
+                <w:szCs w:val="16"/>
+              </w:rPr>
+              <w:t xml:space="preserve">Tarjeta. Se muestra completa, sin recortes.</w:t>
+            </w:r>
+          </w:p>
+          <w:p>
+            <w:pPr>
               <w:spacing w:after="20"/>
             </w:pPr>
             <w:r>
@@ -8370,6 +9445,36 @@
           </w:p>
           <w:p>
             <w:pPr>
+              <w:spacing w:after="20" w:before="60"/>
+            </w:pPr>
+            <w:r>
+              <w:rPr>
+                <w:rFonts w:ascii="Arial" w:cs="Arial" w:eastAsia="Arial" w:hAnsi="Arial"/>
+                <w:b/>
+                <w:bCs/>
+                <w:color w:val="D71920"/>
+                <w:sz w:val="19"/>
+                <w:szCs w:val="19"/>
+              </w:rPr>
+              <w:t xml:space="preserve">MEDIDA: 1200 × 900 px  ·  Horizontal 4:3</w:t>
+            </w:r>
+          </w:p>
+          <w:p>
+            <w:pPr>
+              <w:spacing w:after="40"/>
+            </w:pPr>
+            <w:r>
+              <w:rPr>
+                <w:rFonts w:ascii="Arial" w:cs="Arial" w:eastAsia="Arial" w:hAnsi="Arial"/>
+                <w:color w:val="6B6D70"/>
+                <w:sz w:val="16"/>
+                <w:szCs w:val="16"/>
+              </w:rPr>
+              <w:t xml:space="preserve">Tarjeta. Se muestra completa, sin recortes.</w:t>
+            </w:r>
+          </w:p>
+          <w:p>
+            <w:pPr>
               <w:spacing w:after="20"/>
             </w:pPr>
             <w:r>
@@ -8740,6 +9845,36 @@
                   </a:graphic>
                 </wp:inline>
               </w:drawing>
+            </w:r>
+          </w:p>
+          <w:p>
+            <w:pPr>
+              <w:spacing w:after="20" w:before="60"/>
+            </w:pPr>
+            <w:r>
+              <w:rPr>
+                <w:rFonts w:ascii="Arial" w:cs="Arial" w:eastAsia="Arial" w:hAnsi="Arial"/>
+                <w:b/>
+                <w:bCs/>
+                <w:color w:val="D71920"/>
+                <w:sz w:val="19"/>
+                <w:szCs w:val="19"/>
+              </w:rPr>
+              <w:t xml:space="preserve">MEDIDA: 1200 × 900 px  ·  Horizontal 4:3</w:t>
+            </w:r>
+          </w:p>
+          <w:p>
+            <w:pPr>
+              <w:spacing w:after="40"/>
+            </w:pPr>
+            <w:r>
+              <w:rPr>
+                <w:rFonts w:ascii="Arial" w:cs="Arial" w:eastAsia="Arial" w:hAnsi="Arial"/>
+                <w:color w:val="6B6D70"/>
+                <w:sz w:val="16"/>
+                <w:szCs w:val="16"/>
+              </w:rPr>
+              <w:t xml:space="preserve">Tarjeta. Se muestra completa, sin recortes.</w:t>
             </w:r>
           </w:p>
           <w:p>
@@ -11146,6 +12281,36 @@
                   </a:graphic>
                 </wp:inline>
               </w:drawing>
+            </w:r>
+          </w:p>
+          <w:p>
+            <w:pPr>
+              <w:spacing w:after="20" w:before="60"/>
+            </w:pPr>
+            <w:r>
+              <w:rPr>
+                <w:rFonts w:ascii="Arial" w:cs="Arial" w:eastAsia="Arial" w:hAnsi="Arial"/>
+                <w:b/>
+                <w:bCs/>
+                <w:color w:val="D71920"/>
+                <w:sz w:val="19"/>
+                <w:szCs w:val="19"/>
+              </w:rPr>
+              <w:t xml:space="preserve">MEDIDA: 2400 × 1350 px  ·  Horizontal 16:9</w:t>
+            </w:r>
+          </w:p>
+          <w:p>
+            <w:pPr>
+              <w:spacing w:after="40"/>
+            </w:pPr>
+            <w:r>
+              <w:rPr>
+                <w:rFonts w:ascii="Arial" w:cs="Arial" w:eastAsia="Arial" w:hAnsi="Arial"/>
+                <w:color w:val="6B6D70"/>
+                <w:sz w:val="16"/>
+                <w:szCs w:val="16"/>
+              </w:rPr>
+              <w:t xml:space="preserve">Fondo de pantalla completa. El texto va a la izquierda: ponga lo importante de la foto a la derecha.</w:t>
             </w:r>
           </w:p>
           <w:p>

</xml_diff>